<commit_message>
Update laporan Backpropagation versi final
</commit_message>
<xml_diff>
--- a/laporan/Laporan_Fix.docx
+++ b/laporan/Laporan_Fix.docx
@@ -8968,7 +8968,7 @@
     <w:p>
       <w:pPr>
         <w:rPr>
-          <w:rFonts w:ascii="Times New Roman" w:hAnsi="Times New Roman" w:cs="Times New Roman"/>
+          <w:rFonts w:cs="Times New Roman"/>
         </w:rPr>
       </w:pPr>
       <w:r>
@@ -8976,9 +8976,37 @@
           <w:rFonts w:cs="Times New Roman"/>
         </w:rPr>
         <w:t xml:space="preserve">Berikut link repositori github </w:t>
+      </w:r>
+      <w:hyperlink r:id="rId10" w:history="1">
+        <w:r>
+          <w:rPr>
+            <w:rStyle w:val="Hyperlink"/>
+            <w:rFonts w:cs="Times New Roman"/>
+          </w:rPr>
+          <w:t>https://github.com/Quera14/backpropagation_Ali</w:t>
+        </w:r>
+      </w:hyperlink>
+      <w:r>
+        <w:rPr>
+          <w:rFonts w:cs="Times New Roman"/>
+        </w:rPr>
+        <w:t xml:space="preserve"> </w:t>
       </w:r>
       <w:bookmarkStart w:id="0" w:name="_GoBack"/>
       <w:bookmarkEnd w:id="0"/>
+    </w:p>
+    <w:p>
+      <w:pPr>
+        <w:rPr>
+          <w:rFonts w:ascii="Times New Roman" w:hAnsi="Times New Roman" w:cs="Times New Roman"/>
+        </w:rPr>
+      </w:pPr>
+      <w:r>
+        <w:rPr>
+          <w:rFonts w:cs="Times New Roman"/>
+        </w:rPr>
+        <w:t xml:space="preserve"> </w:t>
+      </w:r>
     </w:p>
     <w:p>
       <w:pPr>
@@ -9046,6 +9074,7 @@
           <w:rFonts w:ascii="Arial" w:hAnsi="Arial" w:cs="Times New Roman"/>
           <w:color w:val="auto"/>
         </w:rPr>
+        <w:lastRenderedPageBreak/>
         <w:t>B</w:t>
       </w:r>
       <w:r>
@@ -9074,7 +9103,6 @@
           <w:rFonts w:ascii="Arial" w:hAnsi="Arial" w:cs="Times New Roman"/>
           <w:color w:val="auto"/>
         </w:rPr>
-        <w:lastRenderedPageBreak/>
         <w:t>C.</w:t>
       </w:r>
       <w:r>
@@ -17358,8 +17386,8 @@
       </w:r>
     </w:p>
     <w:sectPr>
-      <w:headerReference w:type="default" r:id="rId10"/>
-      <w:footerReference w:type="default" r:id="rId11"/>
+      <w:headerReference w:type="default" r:id="rId11"/>
+      <w:footerReference w:type="default" r:id="rId12"/>
       <w:pgSz w:w="11909" w:h="16834"/>
       <w:pgMar w:top="950" w:right="1123" w:bottom="965" w:left="1195" w:header="403" w:footer="547" w:gutter="0"/>
       <w:cols w:space="720"/>
@@ -29454,6 +29482,29 @@
       <w:sz w:val="16"/>
     </w:rPr>
   </w:style>
+  <w:style w:type="character" w:styleId="Hyperlink">
+    <w:name w:val="Hyperlink"/>
+    <w:basedOn w:val="DefaultParagraphFont"/>
+    <w:uiPriority w:val="99"/>
+    <w:unhideWhenUsed/>
+    <w:rsid w:val="006A2EC4"/>
+    <w:rPr>
+      <w:color w:val="0000FF" w:themeColor="hyperlink"/>
+      <w:u w:val="single"/>
+    </w:rPr>
+  </w:style>
+  <w:style w:type="character" w:styleId="UnresolvedMention">
+    <w:name w:val="Unresolved Mention"/>
+    <w:basedOn w:val="DefaultParagraphFont"/>
+    <w:uiPriority w:val="99"/>
+    <w:semiHidden/>
+    <w:unhideWhenUsed/>
+    <w:rsid w:val="006A2EC4"/>
+    <w:rPr>
+      <w:color w:val="605E5C"/>
+      <w:shd w:val="clear" w:color="auto" w:fill="E1DFDD"/>
+    </w:rPr>
+  </w:style>
 </w:styles>
 </file>
 
@@ -29782,7 +29833,7 @@
 </file>
 
 <file path=customXml/itemProps1.xml><?xml version="1.0" encoding="utf-8"?>
-<ds:datastoreItem xmlns:ds="http://schemas.openxmlformats.org/officeDocument/2006/customXml" ds:itemID="{54CA0B7E-26E3-4964-9B6C-34D0B5655005}">
+<ds:datastoreItem xmlns:ds="http://schemas.openxmlformats.org/officeDocument/2006/customXml" ds:itemID="{56DBAABB-0EEA-4C50-A787-45E10E867DE3}">
   <ds:schemaRefs>
     <ds:schemaRef ds:uri="http://schemas.openxmlformats.org/officeDocument/2006/bibliography"/>
   </ds:schemaRefs>

</xml_diff>